<commit_message>
Unify bilingual competition rules and private online materials workflow
</commit_message>
<xml_diff>
--- a/brief/qualification-application.en.docx
+++ b/brief/qualification-application.en.docx
@@ -15,14 +15,14 @@
         <w:pStyle w:val="Title"/>
       </w:pPr>
       <w:r>
-        <w:t>Qualification Application Form</w:t>
+        <w:t>Application Worksheet</w:t>
         <w:br/>
         <w:t>and Materials Checklist</w:t>
       </w:r>
     </w:p>
     <w:p>
       <w:r>
-        <w:t>Complete this form and reply to competition@xcity.ai with applicable evidence, team and project references, and initial ideas of up to ten pages. Complete materials enter stage-one eligibility and selection review.</w:t>
+        <w:t>This optional worksheet helps you prepare. Register on the official website; we will email a private application link. Complete the online form, evidence and references, upload a 1–10-page ideas PDF, save progress and finally submit. No Word upload is required. Do not email application attachments.</w:t>
       </w:r>
     </w:p>
     <w:p>
@@ -33,7 +33,7 @@
         <w:rPr>
           <w:sz w:val="18"/>
         </w:rPr>
-        <w:t>Online application deadline: 31 December 2026, 23:59 UTC. Complete email reply: 31 January 2027, 23:59 UTC. Five teams will be selected in February 2027.</w:t>
+        <w:t>Registration deadline: 31 December 2026, 23:59 UTC. Complete online application: 31 January 2027, 23:59 UTC. Five teams will be selected in February 2027.</w:t>
       </w:r>
     </w:p>
     <w:p>
@@ -44,7 +44,7 @@
         <w:rPr>
           <w:sz w:val="18"/>
         </w:rPr>
-        <w:t>Chinese or English is accepted. Click the grey fields to complete them; extend or copy sections as needed. Explain items that do not apply; do not obtain certificates that are not applicable.</w:t>
+        <w:t>Chinese or English is accepted. Use grey fields for preparation, then complete the private online form. Explain inapplicable items; do not obtain irrelevant certificates. This Word file is not a formal submission.</w:t>
       </w:r>
     </w:p>
     <w:p>
@@ -2370,7 +2370,7 @@
     </w:p>
     <w:p>
       <w:r>
-        <w:t>In the right column, enter attached filenames or links. For a conditional item, state not applicable and explain why. Files may remain separate; do not merge everything into one large PDF.</w:t>
+        <w:t>Use the right column to prepare filenames or links. Explain conditional items that do not apply. Complete and upload each item on your private online page; no combined PDF or upload of this Word worksheet is required.</w:t>
       </w:r>
     </w:p>
     <w:tbl>
@@ -2479,7 +2479,7 @@
               <w:spacing w:after="60" w:before="40" w:line="252" w:lineRule="auto"/>
             </w:pPr>
             <w:r>
-              <w:t>This qualification application form</w:t>
+              <w:t>Online qualification application form</w:t>
             </w:r>
           </w:p>
         </w:tc>
@@ -2499,7 +2499,7 @@
               <w:spacing w:after="60" w:before="40" w:line="252" w:lineRule="auto"/>
             </w:pPr>
             <w:r>
-              <w:t>Completed Word file or exported PDF</w:t>
+              <w:t>Complete on your private page No Word upload</w:t>
             </w:r>
           </w:p>
         </w:tc>
@@ -2736,7 +2736,7 @@
               <w:spacing w:after="60" w:before="40" w:line="252" w:lineRule="auto"/>
             </w:pPr>
             <w:r>
-              <w:t>Section 3 Supplementary pages if needed</w:t>
+              <w:t>Complete online Section 3 is a preparation aid</w:t>
             </w:r>
           </w:p>
         </w:tc>
@@ -2815,7 +2815,7 @@
               <w:spacing w:after="60" w:before="40" w:line="252" w:lineRule="auto"/>
             </w:pPr>
             <w:r>
-              <w:t>Section 4 Portfolio or project links</w:t>
+              <w:t>Complete online Portfolio file or project links</w:t>
             </w:r>
           </w:p>
         </w:tc>
@@ -2894,7 +2894,7 @@
               <w:spacing w:after="60" w:before="40" w:line="252" w:lineRule="auto"/>
             </w:pPr>
             <w:r>
-              <w:t>Separate PDF Up to 10 pages</w:t>
+              <w:t>Separate 1–10-page PDF Upload online</w:t>
             </w:r>
           </w:p>
         </w:tc>
@@ -3052,7 +3052,7 @@
               <w:spacing w:after="60" w:before="40" w:line="252" w:lineRule="auto"/>
             </w:pPr>
             <w:r>
-              <w:t>Complete section 6</w:t>
+              <w:t>Confirm online Section 6 is preparation only</w:t>
             </w:r>
           </w:p>
         </w:tc>
@@ -3102,7 +3102,7 @@
     </w:p>
     <w:p>
       <w:r>
-        <w:t>Use up to ten pages to explain the site reading, initial city and five-system direction, phase-one logic, a representative spatial idea and your approach. Sketches, diagrams or sections are sufficient; a full masterplan or rendering is not required at this stage.</w:t>
+        <w:t>Use a 1–10-page PDF to explain the site reading, initial city and five-system direction, phase-one logic, a representative spatial idea and your approach. Sketches, diagrams or sections are sufficient; a full masterplan or rendering is not required at this stage.</w:t>
       </w:r>
     </w:p>
     <w:p>
@@ -3113,7 +3113,7 @@
         <w:rPr>
           <w:sz w:val="18"/>
         </w:rPr>
-        <w:t>Ordinary electronic copies or scans are accepted. Links must be accessible to the organiser; explain access restrictions in your email. If files are too large to email, contact competition@xcity.ai to agree a transfer method.</w:t>
+        <w:t>Evidence uploads: PDF, PNG or JPG; each file up to 10 MB, total uploads up to 25 MB. Accepted evidence/project links must be accessible to authorised reviewers; explain access restrictions online. Email delivers the private link, not application attachments.</w:t>
       </w:r>
     </w:p>
     <w:p>
@@ -3126,12 +3126,12 @@
         <w:pStyle w:val="Heading1"/>
       </w:pPr>
       <w:r>
-        <w:t>6 Declaration and email reply</w:t>
+        <w:t>6 Declaration and online submission</w:t>
       </w:r>
     </w:p>
     <w:p>
       <w:r>
-        <w:t>An authorised representative of the practice or consortium should read and confirm the following. Enter your name and date to confirm the application declaration.</w:t>
+        <w:t>An authorised representative should read these declarations. Prepare names, dates and statements here if useful; make the formal confirmation on the private online application page.</w:t>
       </w:r>
     </w:p>
     <w:p>
@@ -3374,12 +3374,12 @@
         <w:pStyle w:val="Heading2"/>
       </w:pPr>
       <w:r>
-        <w:t>How to reply</w:t>
+        <w:t>How to complete the online application</w:t>
       </w:r>
     </w:p>
     <w:p>
       <w:r>
-        <w:t>Reply to the organiser’s application email at competition@xcity.ai. Suggested subject: XCITY Design Practice Application Institution name Application reference if any. Attach this form, applicable materials and a separate initial-ideas PDF.</w:t>
+        <w:t>Open the private link emailed by the organiser. Complete each item and provide the materials on the official website; save and return as needed, then make the final submission. Keep the link private. For link or upload assistance contact competition@xcity.ai; do not email application attachments.</w:t>
       </w:r>
     </w:p>
     <w:p>
@@ -3390,7 +3390,7 @@
         <w:rPr>
           <w:sz w:val="18"/>
         </w:rPr>
-        <w:t>Complete replies are due by 31 January 2027, 23:59 UTC. Online application or receipt of materials does not mean eligibility approval or shortlisting. Complete applicable materials enter stage-one review.</w:t>
+        <w:t>Final online submission is due by 31 January 2027, 23:59 UTC. Registration or a saved draft alone does not complete stage one. Final submission enters review; it does not mean eligibility approval or shortlisting.</w:t>
       </w:r>
     </w:p>
     <w:sectPr>

</xml_diff>